<commit_message>
PZ4: remove group line from report title page
</commit_message>
<xml_diff>
--- a/Практическое занятие №4/Отчёт ПЗ4.docx
+++ b/Практическое занятие №4/Отчёт ПЗ4.docx
@@ -111,19 +111,6 @@
           <w:szCs w:val="28"/>
         </w:rPr>
         <w:t xml:space="preserve">Студент: Шевченко Р.</w:t>
-      </w:r>
-    </w:p>
-    <w:p>
-      <w:pPr>
-        <w:jc w:val="right"/>
-      </w:pPr>
-      <w:r>
-        <w:rPr>
-          <w:rFonts w:ascii="Times New Roman" w:cs="Times New Roman" w:eastAsia="Times New Roman" w:hAnsi="Times New Roman"/>
-          <w:sz w:val="28"/>
-          <w:szCs w:val="28"/>
-        </w:rPr>
-        <w:t xml:space="preserve">Группа: ______________</w:t>
       </w:r>
     </w:p>
     <w:p>

</xml_diff>